<commit_message>
Kim12_tema-1-unite-sonu-sorulari: gorsel alanlarina Shutter onizlemeleri yerlestirildi (2.3 bicimi)
</commit_message>
<xml_diff>
--- a/sorular/Kim12_tema-1-unite-sonu-sorulari.docx
+++ b/sorular/Kim12_tema-1-unite-sonu-sorulari.docx
@@ -1593,85 +1593,59 @@
         <w:t xml:space="preserve">Anadolu’nun pek çok şehrinde bakır kaplar, yemeklerdeki asitlerle temas ederek bakır iyonlarının yemeğe geçmesini önlemek amacıyla yüzyıllardır kalaylanmaktadır. Kalaycı ustası kabı önce kumla ve asitle temizler, ardından ısıttığı kabın iç yüzeyine eriyen kalayı pamukla sürerek ince ve parlak bir tabaka oluşturur. Ustalar kalaylı kapların yıllar içinde, özellikle ekşi ve tuzlu yemekler pişirildikçe matlaştığını ve kalayın yenilenmesi gerektiğini söyler. Kalaylanmadan uzun süre havada bekleyen bakır kapların yüzeyi ise kararır.</w:t>
       </w:r>
     </w:p>
-    <w:tbl>
-      <w:tblPr>
-        <w:tblW w:w="9000" w:type="dxa"/>
+    <w:p>
+      <w:pPr>
         <w:jc w:val="center"/>
-        <w:tblBorders>
-          <w:top w:val="single" w:sz="8" w:space="0" w:color="7F7F7F"/>
-          <w:left w:val="single" w:sz="8" w:space="0" w:color="7F7F7F"/>
-          <w:bottom w:val="single" w:sz="8" w:space="0" w:color="7F7F7F"/>
-          <w:right w:val="single" w:sz="8" w:space="0" w:color="7F7F7F"/>
-        </w:tblBorders>
-      </w:tblPr>
-      <w:tblGrid>
-        <w:gridCol w:w="9000"/>
-      </w:tblGrid>
-      <w:tr>
-        <w:tc>
-          <w:tcPr>
-            <w:tcW w:w="9000" w:type="dxa"/>
-            <w:shd w:val="clear" w:color="auto" w:fill="EDEDED"/>
-          </w:tcPr>
-          <w:p>
-            <w:pPr>
-              <w:jc w:val="both"/>
-              <w:rPr>
-                <w:rFonts w:ascii="Times New Roman" w:hAnsi="Times New Roman" w:cs="Times New Roman"/>
-                <w:lang w:val="tr-TR"/>
-              </w:rPr>
-            </w:pPr>
-            <w:r>
-              <w:rPr>
-                <w:rFonts w:ascii="Times New Roman" w:hAnsi="Times New Roman" w:cs="Times New Roman"/>
-                <w:lang w:val="tr-TR"/>
-              </w:rPr>
-              <w:t xml:space="preserve">GÖRSEL ALANI (Shutterstock)</w:t>
-            </w:r>
-          </w:p>
-          <w:p>
-            <w:pPr>
-              <w:jc w:val="both"/>
-              <w:rPr>
-                <w:rFonts w:ascii="Times New Roman" w:hAnsi="Times New Roman" w:cs="Times New Roman"/>
-                <w:lang w:val="tr-TR"/>
-              </w:rPr>
-            </w:pPr>
-            <w:r>
-              <w:rPr>
-                <w:rFonts w:ascii="Times New Roman" w:hAnsi="Times New Roman" w:cs="Times New Roman"/>
-                <w:lang w:val="tr-TR"/>
-              </w:rPr>
-              <w:t xml:space="preserve">Tarif: Bir kalaycı ustasının ısıttığı bakır kazanın iç yüzeyini parlak kalayla kaplaması; ocakta kor ve dumanlar (yüzü seçilmeyen usta).</w:t>
-            </w:r>
-          </w:p>
-          <w:p>
-            <w:pPr>
-              <w:jc w:val="both"/>
-              <w:rPr>
-                <w:rFonts w:ascii="Times New Roman" w:hAnsi="Times New Roman" w:cs="Times New Roman"/>
-                <w:lang w:val="tr-TR"/>
-              </w:rPr>
-            </w:pPr>
-            <w:r>
-              <w:rPr>
-                <w:rFonts w:ascii="Times New Roman" w:hAnsi="Times New Roman" w:cs="Times New Roman"/>
-                <w:lang w:val="tr-TR"/>
-              </w:rPr>
-              <w:t xml:space="preserve">Shutter ID: 2434664279 (fotoğraf) — Traditional Turkish tinsmith tinning a copper pot</w:t>
-            </w:r>
-          </w:p>
-        </w:tc>
-      </w:tr>
-    </w:tbl>
-    <w:p>
-      <w:pPr>
-        <w:jc w:val="both"/>
-        <w:rPr>
-          <w:rFonts w:ascii="Times New Roman" w:hAnsi="Times New Roman" w:cs="Times New Roman"/>
-          <w:lang w:val="tr-TR"/>
-        </w:rPr>
-      </w:pPr>
+      </w:pPr>
+      <w:r>
+        <w:drawing>
+          <wp:inline xmlns:a="http://schemas.openxmlformats.org/drawingml/2006/main" xmlns:pic="http://schemas.openxmlformats.org/drawingml/2006/picture">
+            <wp:extent cx="3436363" cy="2520000"/>
+            <wp:docPr id="900006" name="Picture 900006"/>
+            <wp:cNvGraphicFramePr>
+              <a:graphicFrameLocks noChangeAspect="1"/>
+            </wp:cNvGraphicFramePr>
+            <a:graphic>
+              <a:graphicData uri="http://schemas.openxmlformats.org/drawingml/2006/picture">
+                <pic:pic>
+                  <pic:nvPicPr>
+                    <pic:cNvPr id="0" name="2434664279_d.jpg"/>
+                    <pic:cNvPicPr/>
+                  </pic:nvPicPr>
+                  <pic:blipFill>
+                    <a:blip r:embed="rId11"/>
+                    <a:stretch>
+                      <a:fillRect/>
+                    </a:stretch>
+                  </pic:blipFill>
+                  <pic:spPr>
+                    <a:xfrm>
+                      <a:off x="0" y="0"/>
+                      <a:ext cx="3436363" cy="2520000"/>
+                    </a:xfrm>
+                    <a:prstGeom prst="rect"/>
+                  </pic:spPr>
+                </pic:pic>
+              </a:graphicData>
+            </a:graphic>
+          </wp:inline>
+        </w:drawing>
+      </w:r>
+    </w:p>
+    <w:p>
+      <w:pPr>
+        <w:jc w:val="center"/>
+      </w:pPr>
+      <w:r>
+        <w:rPr>
+          <w:rFonts w:ascii="Times New Roman" w:hAnsi="Times New Roman" w:cs="Times New Roman"/>
+          <w:b/>
+          <w:bCs/>
+          <w:highlight w:val="yellow"/>
+          <w:lang w:val="tr-TR"/>
+        </w:rPr>
+        <w:t xml:space="preserve">Shutter id: 2434664279</w:t>
+      </w:r>
     </w:p>
     <w:p>
       <w:pPr>
@@ -2840,85 +2814,59 @@
         <w:t xml:space="preserve">Tablodaki veriler öğretim amaçlı olarak düzenlenmiştir.</w:t>
       </w:r>
     </w:p>
-    <w:tbl>
-      <w:tblPr>
-        <w:tblW w:w="9000" w:type="dxa"/>
+    <w:p>
+      <w:pPr>
         <w:jc w:val="center"/>
-        <w:tblBorders>
-          <w:top w:val="single" w:sz="8" w:space="0" w:color="7F7F7F"/>
-          <w:left w:val="single" w:sz="8" w:space="0" w:color="7F7F7F"/>
-          <w:bottom w:val="single" w:sz="8" w:space="0" w:color="7F7F7F"/>
-          <w:right w:val="single" w:sz="8" w:space="0" w:color="7F7F7F"/>
-        </w:tblBorders>
-      </w:tblPr>
-      <w:tblGrid>
-        <w:gridCol w:w="9000"/>
-      </w:tblGrid>
-      <w:tr>
-        <w:tc>
-          <w:tcPr>
-            <w:tcW w:w="9000" w:type="dxa"/>
-            <w:shd w:val="clear" w:color="auto" w:fill="EDEDED"/>
-          </w:tcPr>
-          <w:p>
-            <w:pPr>
-              <w:jc w:val="both"/>
-              <w:rPr>
-                <w:rFonts w:ascii="Times New Roman" w:hAnsi="Times New Roman" w:cs="Times New Roman"/>
-                <w:lang w:val="tr-TR"/>
-              </w:rPr>
-            </w:pPr>
-            <w:r>
-              <w:rPr>
-                <w:rFonts w:ascii="Times New Roman" w:hAnsi="Times New Roman" w:cs="Times New Roman"/>
-                <w:lang w:val="tr-TR"/>
-              </w:rPr>
-              <w:t xml:space="preserve">GÖRSEL ALANI (Shutterstock)</w:t>
-            </w:r>
-          </w:p>
-          <w:p>
-            <w:pPr>
-              <w:jc w:val="both"/>
-              <w:rPr>
-                <w:rFonts w:ascii="Times New Roman" w:hAnsi="Times New Roman" w:cs="Times New Roman"/>
-                <w:lang w:val="tr-TR"/>
-              </w:rPr>
-            </w:pPr>
-            <w:r>
-              <w:rPr>
-                <w:rFonts w:ascii="Times New Roman" w:hAnsi="Times New Roman" w:cs="Times New Roman"/>
-                <w:lang w:val="tr-TR"/>
-              </w:rPr>
-              <w:t xml:space="preserve">Tarif: Kesilmiş iki patatese batırılmış çinko ve bakır şeritlerin kablolarla seri bağlanarak küçük bir LED’i yaktığı düzenek.</w:t>
-            </w:r>
-          </w:p>
-          <w:p>
-            <w:pPr>
-              <w:jc w:val="both"/>
-              <w:rPr>
-                <w:rFonts w:ascii="Times New Roman" w:hAnsi="Times New Roman" w:cs="Times New Roman"/>
-                <w:lang w:val="tr-TR"/>
-              </w:rPr>
-            </w:pPr>
-            <w:r>
-              <w:rPr>
-                <w:rFonts w:ascii="Times New Roman" w:hAnsi="Times New Roman" w:cs="Times New Roman"/>
-                <w:lang w:val="tr-TR"/>
-              </w:rPr>
-              <w:t xml:space="preserve">Shutter ID: 2252541981 (fotoğraf) — Potato battery on white background</w:t>
-            </w:r>
-          </w:p>
-        </w:tc>
-      </w:tr>
-    </w:tbl>
-    <w:p>
-      <w:pPr>
-        <w:jc w:val="both"/>
-        <w:rPr>
-          <w:rFonts w:ascii="Times New Roman" w:hAnsi="Times New Roman" w:cs="Times New Roman"/>
-          <w:lang w:val="tr-TR"/>
-        </w:rPr>
-      </w:pPr>
+      </w:pPr>
+      <w:r>
+        <w:drawing>
+          <wp:inline xmlns:a="http://schemas.openxmlformats.org/drawingml/2006/main" xmlns:pic="http://schemas.openxmlformats.org/drawingml/2006/picture">
+            <wp:extent cx="3430127" cy="2520000"/>
+            <wp:docPr id="900007" name="Picture 900007"/>
+            <wp:cNvGraphicFramePr>
+              <a:graphicFrameLocks noChangeAspect="1"/>
+            </wp:cNvGraphicFramePr>
+            <a:graphic>
+              <a:graphicData uri="http://schemas.openxmlformats.org/drawingml/2006/picture">
+                <pic:pic>
+                  <pic:nvPicPr>
+                    <pic:cNvPr id="0" name="2252541981_d.jpg"/>
+                    <pic:cNvPicPr/>
+                  </pic:nvPicPr>
+                  <pic:blipFill>
+                    <a:blip r:embed="rId12"/>
+                    <a:stretch>
+                      <a:fillRect/>
+                    </a:stretch>
+                  </pic:blipFill>
+                  <pic:spPr>
+                    <a:xfrm>
+                      <a:off x="0" y="0"/>
+                      <a:ext cx="3430127" cy="2520000"/>
+                    </a:xfrm>
+                    <a:prstGeom prst="rect"/>
+                  </pic:spPr>
+                </pic:pic>
+              </a:graphicData>
+            </a:graphic>
+          </wp:inline>
+        </w:drawing>
+      </w:r>
+    </w:p>
+    <w:p>
+      <w:pPr>
+        <w:jc w:val="center"/>
+      </w:pPr>
+      <w:r>
+        <w:rPr>
+          <w:rFonts w:ascii="Times New Roman" w:hAnsi="Times New Roman" w:cs="Times New Roman"/>
+          <w:b/>
+          <w:bCs/>
+          <w:highlight w:val="yellow"/>
+          <w:lang w:val="tr-TR"/>
+        </w:rPr>
+        <w:t xml:space="preserve">Shutter id: 2252541981</w:t>
+      </w:r>
     </w:p>
     <w:p>
       <w:pPr>
@@ -4293,85 +4241,59 @@
         <w:t xml:space="preserve">Gerçek pillerde lityum ve sodyum metalleri sulu çözeltilerle doğrudan temas ettirilmez; bu hücreler yalnızca karşılaştırma amacıyla düşünülmüştür.</w:t>
       </w:r>
     </w:p>
-    <w:tbl>
-      <w:tblPr>
-        <w:tblW w:w="9000" w:type="dxa"/>
+    <w:p>
+      <w:pPr>
         <w:jc w:val="center"/>
-        <w:tblBorders>
-          <w:top w:val="single" w:sz="8" w:space="0" w:color="7F7F7F"/>
-          <w:left w:val="single" w:sz="8" w:space="0" w:color="7F7F7F"/>
-          <w:bottom w:val="single" w:sz="8" w:space="0" w:color="7F7F7F"/>
-          <w:right w:val="single" w:sz="8" w:space="0" w:color="7F7F7F"/>
-        </w:tblBorders>
-      </w:tblPr>
-      <w:tblGrid>
-        <w:gridCol w:w="9000"/>
-      </w:tblGrid>
-      <w:tr>
-        <w:tc>
-          <w:tcPr>
-            <w:tcW w:w="9000" w:type="dxa"/>
-            <w:shd w:val="clear" w:color="auto" w:fill="EDEDED"/>
-          </w:tcPr>
-          <w:p>
-            <w:pPr>
-              <w:jc w:val="both"/>
-              <w:rPr>
-                <w:rFonts w:ascii="Times New Roman" w:hAnsi="Times New Roman" w:cs="Times New Roman"/>
-                <w:lang w:val="tr-TR"/>
-              </w:rPr>
-            </w:pPr>
-            <w:r>
-              <w:rPr>
-                <w:rFonts w:ascii="Times New Roman" w:hAnsi="Times New Roman" w:cs="Times New Roman"/>
-                <w:lang w:val="tr-TR"/>
-              </w:rPr>
-              <w:t xml:space="preserve">GÖRSEL ALANI (Shutterstock)</w:t>
-            </w:r>
-          </w:p>
-          <w:p>
-            <w:pPr>
-              <w:jc w:val="both"/>
-              <w:rPr>
-                <w:rFonts w:ascii="Times New Roman" w:hAnsi="Times New Roman" w:cs="Times New Roman"/>
-                <w:lang w:val="tr-TR"/>
-              </w:rPr>
-            </w:pPr>
-            <w:r>
-              <w:rPr>
-                <w:rFonts w:ascii="Times New Roman" w:hAnsi="Times New Roman" w:cs="Times New Roman"/>
-                <w:lang w:val="tr-TR"/>
-              </w:rPr>
-              <w:t xml:space="preserve">Tarif: Güneş panellerinin yanında sıralanmış konteyner tipi batarya depolama üniteleri.</w:t>
-            </w:r>
-          </w:p>
-          <w:p>
-            <w:pPr>
-              <w:jc w:val="both"/>
-              <w:rPr>
-                <w:rFonts w:ascii="Times New Roman" w:hAnsi="Times New Roman" w:cs="Times New Roman"/>
-                <w:lang w:val="tr-TR"/>
-              </w:rPr>
-            </w:pPr>
-            <w:r>
-              <w:rPr>
-                <w:rFonts w:ascii="Times New Roman" w:hAnsi="Times New Roman" w:cs="Times New Roman"/>
-                <w:lang w:val="tr-TR"/>
-              </w:rPr>
-              <w:t xml:space="preserve">Shutter ID: 2842698039 (fotoğraf) — Utility-scale battery energy storage system</w:t>
-            </w:r>
-          </w:p>
-        </w:tc>
-      </w:tr>
-    </w:tbl>
-    <w:p>
-      <w:pPr>
-        <w:jc w:val="both"/>
-        <w:rPr>
-          <w:rFonts w:ascii="Times New Roman" w:hAnsi="Times New Roman" w:cs="Times New Roman"/>
-          <w:lang w:val="tr-TR"/>
-        </w:rPr>
-      </w:pPr>
+      </w:pPr>
+      <w:r>
+        <w:drawing>
+          <wp:inline xmlns:a="http://schemas.openxmlformats.org/drawingml/2006/main" xmlns:pic="http://schemas.openxmlformats.org/drawingml/2006/picture">
+            <wp:extent cx="3995771" cy="2520000"/>
+            <wp:docPr id="900008" name="Picture 900008"/>
+            <wp:cNvGraphicFramePr>
+              <a:graphicFrameLocks noChangeAspect="1"/>
+            </wp:cNvGraphicFramePr>
+            <a:graphic>
+              <a:graphicData uri="http://schemas.openxmlformats.org/drawingml/2006/picture">
+                <pic:pic>
+                  <pic:nvPicPr>
+                    <pic:cNvPr id="0" name="2842698039_d.jpg"/>
+                    <pic:cNvPicPr/>
+                  </pic:nvPicPr>
+                  <pic:blipFill>
+                    <a:blip r:embed="rId13"/>
+                    <a:stretch>
+                      <a:fillRect/>
+                    </a:stretch>
+                  </pic:blipFill>
+                  <pic:spPr>
+                    <a:xfrm>
+                      <a:off x="0" y="0"/>
+                      <a:ext cx="3995771" cy="2520000"/>
+                    </a:xfrm>
+                    <a:prstGeom prst="rect"/>
+                  </pic:spPr>
+                </pic:pic>
+              </a:graphicData>
+            </a:graphic>
+          </wp:inline>
+        </w:drawing>
+      </w:r>
+    </w:p>
+    <w:p>
+      <w:pPr>
+        <w:jc w:val="center"/>
+      </w:pPr>
+      <w:r>
+        <w:rPr>
+          <w:rFonts w:ascii="Times New Roman" w:hAnsi="Times New Roman" w:cs="Times New Roman"/>
+          <w:b/>
+          <w:bCs/>
+          <w:highlight w:val="yellow"/>
+          <w:lang w:val="tr-TR"/>
+        </w:rPr>
+        <w:t xml:space="preserve">Shutter id: 2842698039</w:t>
+      </w:r>
     </w:p>
     <w:p>
       <w:pPr>
@@ -7940,85 +7862,59 @@
         <w:t xml:space="preserve">S) oluşumu nedeniyle zamanla kararır. Kararan takıları temizlemenin bir yolu, takıyı tabanına alüminyum folyo serilmiş bir kaptaki sıcak, kabartma tozlu suya folyoya değecek şekilde koymaktır. Bir süre sonra takının yeniden parladığı, folyonun ise takının değdiği yerlerde aşındığı gözlenir.</w:t>
       </w:r>
     </w:p>
-    <w:tbl>
-      <w:tblPr>
-        <w:tblW w:w="9000" w:type="dxa"/>
+    <w:p>
+      <w:pPr>
         <w:jc w:val="center"/>
-        <w:tblBorders>
-          <w:top w:val="single" w:sz="8" w:space="0" w:color="7F7F7F"/>
-          <w:left w:val="single" w:sz="8" w:space="0" w:color="7F7F7F"/>
-          <w:bottom w:val="single" w:sz="8" w:space="0" w:color="7F7F7F"/>
-          <w:right w:val="single" w:sz="8" w:space="0" w:color="7F7F7F"/>
-        </w:tblBorders>
-      </w:tblPr>
-      <w:tblGrid>
-        <w:gridCol w:w="9000"/>
-      </w:tblGrid>
-      <w:tr>
-        <w:tc>
-          <w:tcPr>
-            <w:tcW w:w="9000" w:type="dxa"/>
-            <w:shd w:val="clear" w:color="auto" w:fill="EDEDED"/>
-          </w:tcPr>
-          <w:p>
-            <w:pPr>
-              <w:jc w:val="both"/>
-              <w:rPr>
-                <w:rFonts w:ascii="Times New Roman" w:hAnsi="Times New Roman" w:cs="Times New Roman"/>
-                <w:lang w:val="tr-TR"/>
-              </w:rPr>
-            </w:pPr>
-            <w:r>
-              <w:rPr>
-                <w:rFonts w:ascii="Times New Roman" w:hAnsi="Times New Roman" w:cs="Times New Roman"/>
-                <w:lang w:val="tr-TR"/>
-              </w:rPr>
-              <w:t xml:space="preserve">GÖRSEL ALANI (Shutterstock)</w:t>
-            </w:r>
-          </w:p>
-          <w:p>
-            <w:pPr>
-              <w:jc w:val="both"/>
-              <w:rPr>
-                <w:rFonts w:ascii="Times New Roman" w:hAnsi="Times New Roman" w:cs="Times New Roman"/>
-                <w:lang w:val="tr-TR"/>
-              </w:rPr>
-            </w:pPr>
-            <w:r>
-              <w:rPr>
-                <w:rFonts w:ascii="Times New Roman" w:hAnsi="Times New Roman" w:cs="Times New Roman"/>
-                <w:lang w:val="tr-TR"/>
-              </w:rPr>
-              <w:t xml:space="preserve">Tarif: Yarısı kararmış, yarısı parlatılmış gümüş bir bilezik ya da kaşık; yanında alüminyum folyo serilmiş cam kap.</w:t>
-            </w:r>
-          </w:p>
-          <w:p>
-            <w:pPr>
-              <w:jc w:val="both"/>
-              <w:rPr>
-                <w:rFonts w:ascii="Times New Roman" w:hAnsi="Times New Roman" w:cs="Times New Roman"/>
-                <w:lang w:val="tr-TR"/>
-              </w:rPr>
-            </w:pPr>
-            <w:r>
-              <w:rPr>
-                <w:rFonts w:ascii="Times New Roman" w:hAnsi="Times New Roman" w:cs="Times New Roman"/>
-                <w:lang w:val="tr-TR"/>
-              </w:rPr>
-              <w:t xml:space="preserve">Shutter ID: 1760766737 (fotoğraf) — Cleaning tarnished silver with aluminium foil and baking soda</w:t>
-            </w:r>
-          </w:p>
-        </w:tc>
-      </w:tr>
-    </w:tbl>
-    <w:p>
-      <w:pPr>
-        <w:jc w:val="both"/>
-        <w:rPr>
-          <w:rFonts w:ascii="Times New Roman" w:hAnsi="Times New Roman" w:cs="Times New Roman"/>
-          <w:lang w:val="tr-TR"/>
-        </w:rPr>
-      </w:pPr>
+      </w:pPr>
+      <w:r>
+        <w:drawing>
+          <wp:inline xmlns:a="http://schemas.openxmlformats.org/drawingml/2006/main" xmlns:pic="http://schemas.openxmlformats.org/drawingml/2006/picture">
+            <wp:extent cx="3085714" cy="2520000"/>
+            <wp:docPr id="900009" name="Picture 900009"/>
+            <wp:cNvGraphicFramePr>
+              <a:graphicFrameLocks noChangeAspect="1"/>
+            </wp:cNvGraphicFramePr>
+            <a:graphic>
+              <a:graphicData uri="http://schemas.openxmlformats.org/drawingml/2006/picture">
+                <pic:pic>
+                  <pic:nvPicPr>
+                    <pic:cNvPr id="0" name="1760766737_d.jpg"/>
+                    <pic:cNvPicPr/>
+                  </pic:nvPicPr>
+                  <pic:blipFill>
+                    <a:blip r:embed="rId14"/>
+                    <a:stretch>
+                      <a:fillRect/>
+                    </a:stretch>
+                  </pic:blipFill>
+                  <pic:spPr>
+                    <a:xfrm>
+                      <a:off x="0" y="0"/>
+                      <a:ext cx="3085714" cy="2520000"/>
+                    </a:xfrm>
+                    <a:prstGeom prst="rect"/>
+                  </pic:spPr>
+                </pic:pic>
+              </a:graphicData>
+            </a:graphic>
+          </wp:inline>
+        </w:drawing>
+      </w:r>
+    </w:p>
+    <w:p>
+      <w:pPr>
+        <w:jc w:val="center"/>
+      </w:pPr>
+      <w:r>
+        <w:rPr>
+          <w:rFonts w:ascii="Times New Roman" w:hAnsi="Times New Roman" w:cs="Times New Roman"/>
+          <w:b/>
+          <w:bCs/>
+          <w:highlight w:val="yellow"/>
+          <w:lang w:val="tr-TR"/>
+        </w:rPr>
+        <w:t xml:space="preserve">Shutter id: 1760766737</w:t>
+      </w:r>
     </w:p>
     <w:p>
       <w:pPr>

</xml_diff>